<commit_message>
Shorten feedback_response.docx to 50 words per question
Co-Authored-By: Claude Sonnet 4.6 <noreply@anthropic.com>
</commit_message>
<xml_diff>
--- a/docs/feedback_response.docx
+++ b/docs/feedback_response.docx
@@ -53,10 +53,10 @@
         <w:rPr>
           <w:b/>
         </w:rPr>
-        <w:t>No, for binary exit decisions it does not.</w:t>
+        <w:t>No.</w:t>
       </w:r>
       <w:r>
-        <w:t xml:space="preserve"> On real gold futures volume data (ACF(1-min) = 0.358, ρ_session = 0.36), the ratio heuristic with the matched window W_s = 1/β tracks the true Hawkes intensity at Spearman r = </w:t>
+        <w:t xml:space="preserve"> On real GC=F volume data (ACF = 0.358), the ratio heuristic with matched window W_s = 1/β achieves Spearman r = </w:t>
       </w:r>
       <w:r>
         <w:rPr>
@@ -65,42 +65,7 @@
         <w:t>0.475</w:t>
       </w:r>
       <w:r>
-        <w:t xml:space="preserve"> — positive and sufficient for threshold crossings. The kernel shape becomes irrelevant because rank order is preserved.</w:t>
-      </w:r>
-    </w:p>
-    <w:p>
-      <w:pPr>
-        <w:spacing w:after="120"/>
-      </w:pPr>
-      <w:r>
-        <w:t xml:space="preserve">What </w:t>
-      </w:r>
-      <w:r>
-        <w:rPr>
-          <w:b/>
-        </w:rPr>
-        <w:t>does</w:t>
-      </w:r>
-      <w:r>
-        <w:t xml:space="preserve"> matter is window sizing. Across 53 real burst events, the matched window (W_s = 1 min) detected bursts in </w:t>
-      </w:r>
-      <w:r>
-        <w:rPr>
-          <w:b/>
-        </w:rPr>
-        <w:t>0.94 minutes</w:t>
-      </w:r>
-      <w:r>
-        <w:t xml:space="preserve"> versus </w:t>
-      </w:r>
-      <w:r>
-        <w:rPr>
-          <w:b/>
-        </w:rPr>
-        <w:t>14.1 minutes</w:t>
-      </w:r>
-      <w:r>
-        <w:t xml:space="preserve"> for a 10× mismatched window — </w:t>
+        <w:t xml:space="preserve"> against true Hawkes intensity — sufficient for threshold crossings. Across 53 real bursts, the matched window detected </w:t>
       </w:r>
       <w:r>
         <w:rPr>
@@ -109,22 +74,7 @@
         <w:t>15× faster</w:t>
       </w:r>
       <w:r>
-        <w:t>.</w:t>
-      </w:r>
-    </w:p>
-    <w:p>
-      <w:pPr>
-        <w:spacing w:after="120"/>
-      </w:pPr>
-      <w:r/>
-      <w:r>
-        <w:rPr>
-          <w:b/>
-        </w:rPr>
-        <w:t>Recommendation:</w:t>
-      </w:r>
-      <w:r>
-        <w:t xml:space="preserve"> Keep the ratio heuristic. Calibrate W_s = 1/β from your tick inter-arrival ACF. For near-critical excitation (ρ → 1, e.g. news events on XAUUSD), switch to the O(1) recursive Hawkes update — one float accumulator per tick.</w:t>
+        <w:t xml:space="preserve"> (0.94 min vs 14.1 min). Calibrate W_s = 1/β from your tick ACF.</w:t>
       </w:r>
     </w:p>
     <w:p>
@@ -149,10 +99,10 @@
         <w:rPr>
           <w:b/>
         </w:rPr>
-        <w:t>Yes — but only on the right metric.</w:t>
+        <w:t>Yes, for adverse-selection detection.</w:t>
       </w:r>
       <w:r>
-        <w:t xml:space="preserve"> On real GC=F data the tick-level SNR is </w:t>
+        <w:t xml:space="preserve"> Tick SNR = </w:t>
       </w:r>
       <w:r>
         <w:rPr>
@@ -161,24 +111,7 @@
         <w:t>0.088</w:t>
       </w:r>
       <w:r>
-        <w:t xml:space="preserve"> (spread-dominated, confirmed), meaning filtered price RMSE is near-identical between Kalman and EMA. The advantage is entirely in adverse-selection detection.</w:t>
-      </w:r>
-    </w:p>
-    <w:p>
-      <w:pPr>
-        <w:spacing w:after="120"/>
-      </w:pPr>
-      <w:r>
-        <w:t xml:space="preserve">Across </w:t>
-      </w:r>
-      <w:r>
-        <w:rPr>
-          <w:b/>
-        </w:rPr>
-        <w:t>203 rolling 30-minute trade windows</w:t>
-      </w:r>
-      <w:r>
-        <w:t xml:space="preserve"> on real data, the Kalman z-score rule (z &gt; 2.0) produced FPR = </w:t>
+        <w:t xml:space="preserve"> (spread-dominated). Across 203 real 30-minute trade windows, Kalman z-score FPR = </w:t>
       </w:r>
       <w:r>
         <w:rPr>
@@ -187,7 +120,7 @@
         <w:t>38%</w:t>
       </w:r>
       <w:r>
-        <w:t xml:space="preserve"> versus the EMA ATR rule's </w:t>
+        <w:t xml:space="preserve"> vs EMA ATR FPR = </w:t>
       </w:r>
       <w:r>
         <w:rPr>
@@ -205,7 +138,7 @@
         <w:t>49% reduction</w:t>
       </w:r>
       <w:r>
-        <w:t xml:space="preserve"> in false exits. In wide-spread periods (Q75 spread), the reduction reaches </w:t>
+        <w:t xml:space="preserve">; </w:t>
       </w:r>
       <w:r>
         <w:rPr>
@@ -214,15 +147,7 @@
         <w:t>83%</w:t>
       </w:r>
       <w:r>
-        <w:t>. The EMA cannot adapt its threshold when the spread widens; the Kalman does so automatically through R_obs = (spread/2)².</w:t>
-      </w:r>
-    </w:p>
-    <w:p>
-      <w:pPr>
-        <w:spacing w:after="120"/>
-      </w:pPr>
-      <w:r>
-        <w:t>Replace your ATR-fraction check with:</w:t>
+        <w:t xml:space="preserve"> in wide-spread periods. Replace ATR check with:</w:t>
       </w:r>
     </w:p>
     <w:p>
@@ -237,14 +162,6 @@
           <w:sz w:val="18"/>
         </w:rPr>
         <w:t>z = |p_filtered − p_entry| / √(P[0,0] + (spread/2)²)  &gt;  2.0</w:t>
-      </w:r>
-    </w:p>
-    <w:p>
-      <w:pPr>
-        <w:spacing w:after="120"/>
-      </w:pPr>
-      <w:r>
-        <w:t>Same compute cost as your current ATR check; materially fewer false exits, especially when the spread spikes.</w:t>
       </w:r>
     </w:p>
     <w:p>
@@ -272,7 +189,7 @@
         <w:t>Use the three-region policy.</w:t>
       </w:r>
       <w:r>
-        <w:t xml:space="preserve"> On real GC=F data with a 2-tick scalp target ($0.20) and typical ECN spread ($0.15), the no-exit boundary is q_min = </w:t>
+        <w:t xml:space="preserve"> Real GC=F data: q_min = </w:t>
       </w:r>
       <w:r>
         <w:rPr>
@@ -281,15 +198,16 @@
         <w:t>0.375</w:t>
       </w:r>
       <w:r>
-        <w:t xml:space="preserve"> — any position below 37.5% of capacity has spread cost exceeding expected gain and should never be exited. This is stronger than the paper anticipated: for GC futures scalpers at typical position sizes, the spread barrier is the dominant constraint.</w:t>
+        <w:t xml:space="preserve"> for a 2-tick target — positions below 37.5% of capacity should never exit. At Q = 0.40, </w:t>
       </w:r>
-    </w:p>
-    <w:p>
-      <w:pPr>
-        <w:spacing w:after="120"/>
-      </w:pPr>
       <w:r>
-        <w:t>The three regions:</w:t>
+        <w:rPr>
+          <w:b/>
+        </w:rPr>
+        <w:t>85% of ticks</w:t>
+      </w:r>
+      <w:r>
+        <w:t xml:space="preserve"> are HJB-active. Do not exit if book imbalance favours you and |q| &lt; q* = κ·imb/(2A).</w:t>
       </w:r>
     </w:p>
     <w:p>
@@ -303,7 +221,7 @@
           <w:color w:val="2D6A4F"/>
           <w:sz w:val="18"/>
         </w:rPr>
-        <w:t>|q| &lt; q_min = half_spread / E[gain]   →  never exit (spread &gt; gain)</w:t>
+        <w:t>|q| &lt; q_min                  →  never exit</w:t>
       </w:r>
     </w:p>
     <w:p>
@@ -317,7 +235,7 @@
           <w:color w:val="2D6A4F"/>
           <w:sz w:val="18"/>
         </w:rPr>
-        <w:t>q_min ≤ |q| &lt; q* = κ·imb / (2A)      →  exit only if Kalman z &gt; 2</w:t>
+        <w:t>q_min ≤ |q| &lt; q*             →  exit only if Kalman z &gt; 2</w:t>
       </w:r>
     </w:p>
     <w:p>
@@ -331,50 +249,7 @@
           <w:color w:val="2D6A4F"/>
           <w:sz w:val="18"/>
         </w:rPr>
-        <w:t>|q| ≥ q*                              →  exit when V(q,λ) + F &gt; θ·exp(−t/τ)</w:t>
-      </w:r>
-    </w:p>
-    <w:p>
-      <w:pPr>
-        <w:spacing w:after="120"/>
-      </w:pPr>
-      <w:r>
-        <w:t xml:space="preserve">On real data at Q = 0.40, </w:t>
-      </w:r>
-      <w:r>
-        <w:rPr>
-          <w:b/>
-        </w:rPr>
-        <w:t>85% of ticks</w:t>
-      </w:r>
-      <w:r>
-        <w:t xml:space="preserve"> fall in the HJB-active zone. At Q = 0.08 with a 2-tick target, </w:t>
-      </w:r>
-      <w:r>
-        <w:rPr>
-          <w:b/>
-        </w:rPr>
-        <w:t>100%</w:t>
-      </w:r>
-      <w:r>
-        <w:t xml:space="preserve"> are in the never-exit zone — you need at least a </w:t>
-      </w:r>
-      <w:r>
-        <w:rPr>
-          <w:b/>
-        </w:rPr>
-        <w:t>10-tick target ($1.00)</w:t>
-      </w:r>
-      <w:r>
-        <w:t xml:space="preserve"> to trade the HJB surface efficiently at that position size.</w:t>
-      </w:r>
-    </w:p>
-    <w:p>
-      <w:pPr>
-        <w:spacing w:after="120"/>
-      </w:pPr>
-      <w:r>
-        <w:t>To resolve the gradient conflict: q* is the interior equilibrium where marginal inventory risk exactly offsets the adverse-selection benefit from a favourable book imbalance. Compute it from the current LOB imbalance each tick; do not exit if the book is with you and |q| &lt; q*.</w:t>
+        <w:t>|q| ≥ q*                     →  exit when V(q,λ) + F &gt; θ·exp(−t/τ)</w:t>
       </w:r>
     </w:p>
     <w:p/>

</xml_diff>